<commit_message>
Auto-save: 3 file(s) — 2026-08-25 18:12
</commit_message>
<xml_diff>
--- a/Projects/NEPRA Website Campaign/2026-08-25-nepra-website-copy-deck.docx
+++ b/Projects/NEPRA Website Campaign/2026-08-25-nepra-website-copy-deck.docx
@@ -2099,36 +2099,6 @@
         <w:t xml:space="preserve">  — matches the existing /services/cyber-security-service pattern already on the site.</w:t>
       </w:r>
     </w:p>
-    <w:p>
-      <w:pPr>
-        <w:pStyle w:val="Heading2"/>
-        <w:spacing w:after="120" w:before="300"/>
-      </w:pPr>
-      <w:r>
-        <w:rPr>
-          <w:rFonts w:ascii="Aptos" w:cs="Aptos" w:eastAsia="Aptos" w:hAnsi="Aptos"/>
-          <w:b/>
-          <w:bCs/>
-          <w:color w:val="0A1B3D"/>
-          <w:sz w:val="26"/>
-          <w:szCs w:val="26"/>
-        </w:rPr>
-        <w:t xml:space="preserve">4.1 Recipient acknowledgement — small line above the H1</w:t>
-      </w:r>
-    </w:p>
-    <w:p>
-      <w:pPr>
-        <w:spacing w:after="120" w:line="276"/>
-      </w:pPr>
-      <w:r>
-        <w:rPr>
-          <w:rFonts w:ascii="Aptos" w:cs="Aptos" w:eastAsia="Aptos" w:hAnsi="Aptos"/>
-          <w:sz w:val="21"/>
-          <w:szCs w:val="21"/>
-        </w:rPr>
-        <w:t xml:space="preserve">87 people were sent a physical letter. Telling them they have arrived at the right place costs one line and materially raises the chance they keep reading.</w:t>
-      </w:r>
-    </w:p>
     <w:tbl>
       <w:tblPr>
         <w:tblW w:type="dxa" w:w="9026"/>
@@ -2158,38 +2128,63 @@
           </w:tcPr>
           <w:p>
             <w:pPr>
-              <w:spacing w:after="100"/>
-            </w:pPr>
-            <w:r>
-              <w:rPr>
-                <w:rFonts w:ascii="Aptos" w:cs="Aptos" w:eastAsia="Aptos" w:hAnsi="Aptos"/>
-                <w:b/>
-                <w:bCs/>
-                <w:color w:val="5A6472"/>
-                <w:spacing w:val="30"/>
-                <w:sz w:val="15"/>
-                <w:szCs w:val="15"/>
-              </w:rPr>
-              <w:t xml:space="preserve">ACKNOWLEDGEMENT</w:t>
-            </w:r>
-          </w:p>
-          <w:p>
-            <w:pPr>
-              <w:spacing w:after="40"/>
-            </w:pPr>
-            <w:r>
-              <w:rPr>
-                <w:rFonts w:ascii="Aptos" w:cs="Aptos" w:eastAsia="Aptos" w:hAnsi="Aptos"/>
-                <w:color w:val="5A6472"/>
-                <w:sz w:val="18"/>
-                <w:szCs w:val="18"/>
-              </w:rPr>
-              <w:t xml:space="preserve">Received our letter? You’re in the right place.</w:t>
+              <w:spacing w:after="80"/>
+            </w:pPr>
+            <w:r>
+              <w:rPr>
+                <w:rFonts w:ascii="Aptos" w:cs="Aptos" w:eastAsia="Aptos" w:hAnsi="Aptos"/>
+                <w:b/>
+                <w:bCs/>
+                <w:sz w:val="20"/>
+                <w:szCs w:val="20"/>
+              </w:rPr>
+              <w:t xml:space="preserve">Two sections were cut on review, deliberately. </w:t>
+            </w:r>
+            <w:r>
+              <w:rPr>
+                <w:rFonts w:ascii="Aptos" w:cs="Aptos" w:eastAsia="Aptos" w:hAnsi="Aptos"/>
+                <w:sz w:val="20"/>
+                <w:szCs w:val="20"/>
+              </w:rPr>
+              <w:t xml:space="preserve">There is no letter-recipient acknowledgement line, and no “how the audit runs” process section. The seven-stage methodology stays in the proposal where it belongs.</w:t>
+            </w:r>
+          </w:p>
+          <w:p>
+            <w:r>
+              <w:rPr>
+                <w:rFonts w:ascii="Aptos" w:cs="Aptos" w:eastAsia="Aptos" w:hAnsi="Aptos"/>
+                <w:sz w:val="20"/>
+                <w:szCs w:val="20"/>
+              </w:rPr>
+              <w:t xml:space="preserve">One consequence to be aware of: cutting the process section also cut the “non-intrusive by design” callout, which answers the first objection any plant manager raises. That assurance now lives in the VAPT service copy (4.3) and in the FAQ (4.7), so it is still covered — but do not let either of those two lines get edited away.</w:t>
             </w:r>
           </w:p>
         </w:tc>
       </w:tr>
     </w:tbl>
+    <w:p>
+      <w:pPr>
+        <w:spacing w:after="120" w:line="276"/>
+      </w:pPr>
+      <w:r>
+        <w:rPr>
+          <w:rFonts w:ascii="Aptos" w:cs="Aptos" w:eastAsia="Aptos" w:hAnsi="Aptos"/>
+          <w:b/>
+          <w:bCs/>
+          <w:sz w:val="21"/>
+          <w:szCs w:val="21"/>
+        </w:rPr>
+        <w:t xml:space="preserve">For the design team: </w:t>
+      </w:r>
+      <w:r>
+        <w:rPr>
+          <w:rFonts w:ascii="Aptos" w:cs="Aptos" w:eastAsia="Aptos" w:hAnsi="Aptos"/>
+          <w:sz w:val="21"/>
+          <w:szCs w:val="21"/>
+        </w:rPr>
+        <w:t xml:space="preserve">the block-by-block build spec for this page — final copy, character counts, layout notes and asset list — is in the companion document 2026-08-25-nepra-landing-page-content-spec.docx.</w:t>
+      </w:r>
+    </w:p>
     <w:p>
       <w:pPr>
         <w:pStyle w:val="Heading2"/>
@@ -2204,7 +2199,7 @@
           <w:sz w:val="26"/>
           <w:szCs w:val="26"/>
         </w:rPr>
-        <w:t xml:space="preserve">4.2 Hero</w:t>
+        <w:t xml:space="preserve">4.1 Hero</w:t>
       </w:r>
     </w:p>
     <w:tbl>
@@ -2310,21 +2305,23 @@
                 <w:sz w:val="20"/>
                 <w:szCs w:val="20"/>
               </w:rPr>
-              <w:t xml:space="preserve">[ Book a scoping call → ]</w:t>
-            </w:r>
-          </w:p>
-          <w:p>
-            <w:pPr>
-              <w:spacing w:after="40"/>
-            </w:pPr>
-            <w:r>
-              <w:rPr>
-                <w:rFonts w:ascii="Aptos" w:cs="Aptos" w:eastAsia="Aptos" w:hAnsi="Aptos"/>
-                <w:color w:val="5A6472"/>
-                <w:sz w:val="18"/>
-                <w:szCs w:val="18"/>
-              </w:rPr>
-              <w:t xml:space="preserve">Or call +92 21 3586 9200  ·  xsecurity@xloopdigital.com</w:t>
+              <w:t xml:space="preserve">[ Call +92 21 3586 9200 ]</w:t>
+            </w:r>
+          </w:p>
+          <w:p>
+            <w:pPr>
+              <w:spacing w:after="40" w:before="80"/>
+            </w:pPr>
+            <w:r>
+              <w:rPr>
+                <w:rFonts w:ascii="Aptos" w:cs="Aptos" w:eastAsia="Aptos" w:hAnsi="Aptos"/>
+                <w:b/>
+                <w:bCs/>
+                <w:color w:val="1F6FEB"/>
+                <w:sz w:val="20"/>
+                <w:szCs w:val="20"/>
+              </w:rPr>
+              <w:t xml:space="preserve">[ Email xsecurity@xloopdigital.com ]</w:t>
             </w:r>
           </w:p>
         </w:tc>
@@ -2340,7 +2337,7 @@
           <w:sz w:val="21"/>
           <w:szCs w:val="21"/>
         </w:rPr>
-        <w:t xml:space="preserve">The eyebrow deliberately reuses “POWER ⚡ SECURE” from the printed flyer — it is the visual handshake that tells a letter recipient this is the same thing they were sent.</w:t>
+        <w:t xml:space="preserve">The eyebrow deliberately reuses “POWER ⚡ SECURE” from the printed flyer — it is the visual handshake that tells a letter recipient this is the same thing they were sent. There is no booking link and no form anywhere on this page: the phone number and the email address are the conversion mechanism, exactly as printed on the letter.</w:t>
       </w:r>
     </w:p>
     <w:p>
@@ -2357,7 +2354,7 @@
           <w:sz w:val="26"/>
           <w:szCs w:val="26"/>
         </w:rPr>
-        <w:t xml:space="preserve">4.3 The obligation — why this page exists</w:t>
+        <w:t xml:space="preserve">4.2 The obligation — why this page exists</w:t>
       </w:r>
     </w:p>
     <w:tbl>
@@ -2514,7 +2511,7 @@
           <w:sz w:val="26"/>
           <w:szCs w:val="26"/>
         </w:rPr>
-        <w:t xml:space="preserve">4.4 The four services — the compliance bundle</w:t>
+        <w:t xml:space="preserve">4.3 The four services — the compliance bundle</w:t>
       </w:r>
     </w:p>
     <w:p>
@@ -2678,7 +2675,7 @@
                 <w:sz w:val="20"/>
                 <w:szCs w:val="20"/>
               </w:rPr>
-              <w:t xml:space="preserve">Controlled penetration testing of the IT perimeter, plus a non-intrusive exposure assessment of the OT environment. We find what an attacker would find. We do not touch plant availability doing it.</w:t>
+              <w:t xml:space="preserve">Controlled penetration testing of the IT perimeter, plus a non-intrusive exposure assessment of the OT environment. We find what an attacker would find — without touching plant availability to do it.</w:t>
             </w:r>
           </w:p>
         </w:tc>
@@ -2902,7 +2899,7 @@
           <w:sz w:val="26"/>
           <w:szCs w:val="26"/>
         </w:rPr>
-        <w:t xml:space="preserve">4.5 Coverage table — Regulations 4 to 11</w:t>
+        <w:t xml:space="preserve">4.4 Coverage table — Regulations 4 to 11</w:t>
       </w:r>
     </w:p>
     <w:p>
@@ -3692,309 +3689,7 @@
           <w:sz w:val="26"/>
           <w:szCs w:val="26"/>
         </w:rPr>
-        <w:t xml:space="preserve">4.6 How the audit runs</w:t>
-      </w:r>
-    </w:p>
-    <w:p>
-      <w:pPr>
-        <w:spacing w:after="120" w:line="276"/>
-      </w:pPr>
-      <w:r>
-        <w:rPr>
-          <w:rFonts w:ascii="Aptos" w:cs="Aptos" w:eastAsia="Aptos" w:hAnsi="Aptos"/>
-          <w:sz w:val="21"/>
-          <w:szCs w:val="21"/>
-        </w:rPr>
-        <w:t xml:space="preserve">Seven stages, drawn from the delivered methodology. The point of publishing them is that it answers the question a plant manager actually has, which is “what will you do to my network”.</w:t>
-      </w:r>
-    </w:p>
-    <w:p>
-      <w:pPr>
-        <w:pStyle w:val="ListParagraph"/>
-        <w:numPr>
-          <w:ilvl w:val="0"/>
-          <w:numId w:val="2"/>
-        </w:numPr>
-        <w:spacing w:after="60" w:line="276"/>
-      </w:pPr>
-      <w:r>
-        <w:rPr>
-          <w:rFonts w:ascii="Aptos" w:cs="Aptos" w:eastAsia="Aptos" w:hAnsi="Aptos"/>
-          <w:b/>
-          <w:bCs/>
-          <w:sz w:val="21"/>
-          <w:szCs w:val="21"/>
-        </w:rPr>
-        <w:t xml:space="preserve">Opening meeting. </w:t>
-      </w:r>
-      <w:r>
-        <w:rPr>
-          <w:rFonts w:ascii="Aptos" w:cs="Aptos" w:eastAsia="Aptos" w:hAnsi="Aptos"/>
-          <w:sz w:val="21"/>
-          <w:szCs w:val="21"/>
-        </w:rPr>
-        <w:t xml:space="preserve">Confirm scope, frameworks and evidence process; agree timelines and who owns what.</w:t>
-      </w:r>
-    </w:p>
-    <w:p>
-      <w:pPr>
-        <w:pStyle w:val="ListParagraph"/>
-        <w:numPr>
-          <w:ilvl w:val="0"/>
-          <w:numId w:val="2"/>
-        </w:numPr>
-        <w:spacing w:after="60" w:line="276"/>
-      </w:pPr>
-      <w:r>
-        <w:rPr>
-          <w:rFonts w:ascii="Aptos" w:cs="Aptos" w:eastAsia="Aptos" w:hAnsi="Aptos"/>
-          <w:b/>
-          <w:bCs/>
-          <w:sz w:val="21"/>
-          <w:szCs w:val="21"/>
-        </w:rPr>
-        <w:t xml:space="preserve">Policy and documentation review. </w:t>
-      </w:r>
-      <w:r>
-        <w:rPr>
-          <w:rFonts w:ascii="Aptos" w:cs="Aptos" w:eastAsia="Aptos" w:hAnsi="Aptos"/>
-          <w:sz w:val="21"/>
-          <w:szCs w:val="21"/>
-        </w:rPr>
-        <w:t xml:space="preserve">Policies, network diagrams, access lists and procedures against the regulatory requirement.</w:t>
-      </w:r>
-    </w:p>
-    <w:p>
-      <w:pPr>
-        <w:pStyle w:val="ListParagraph"/>
-        <w:numPr>
-          <w:ilvl w:val="0"/>
-          <w:numId w:val="2"/>
-        </w:numPr>
-        <w:spacing w:after="60" w:line="276"/>
-      </w:pPr>
-      <w:r>
-        <w:rPr>
-          <w:rFonts w:ascii="Aptos" w:cs="Aptos" w:eastAsia="Aptos" w:hAnsi="Aptos"/>
-          <w:b/>
-          <w:bCs/>
-          <w:sz w:val="21"/>
-          <w:szCs w:val="21"/>
-        </w:rPr>
-        <w:t xml:space="preserve">Interviews and process validation. </w:t>
-      </w:r>
-      <w:r>
-        <w:rPr>
-          <w:rFonts w:ascii="Aptos" w:cs="Aptos" w:eastAsia="Aptos" w:hAnsi="Aptos"/>
-          <w:sz w:val="21"/>
-          <w:szCs w:val="21"/>
-        </w:rPr>
-        <w:t xml:space="preserve">IT, OT and plant staff — how controls actually work day to day, not how they are written down.</w:t>
-      </w:r>
-    </w:p>
-    <w:p>
-      <w:pPr>
-        <w:pStyle w:val="ListParagraph"/>
-        <w:numPr>
-          <w:ilvl w:val="0"/>
-          <w:numId w:val="2"/>
-        </w:numPr>
-        <w:spacing w:after="60" w:line="276"/>
-      </w:pPr>
-      <w:r>
-        <w:rPr>
-          <w:rFonts w:ascii="Aptos" w:cs="Aptos" w:eastAsia="Aptos" w:hAnsi="Aptos"/>
-          <w:b/>
-          <w:bCs/>
-          <w:sz w:val="21"/>
-          <w:szCs w:val="21"/>
-        </w:rPr>
-        <w:t xml:space="preserve">Evidence verification and technical sampling. </w:t>
-      </w:r>
-      <w:r>
-        <w:rPr>
-          <w:rFonts w:ascii="Aptos" w:cs="Aptos" w:eastAsia="Aptos" w:hAnsi="Aptos"/>
-          <w:sz w:val="21"/>
-          <w:szCs w:val="21"/>
-        </w:rPr>
-        <w:t xml:space="preserve">Access logs, patch reports, backup records, selective configuration checks.</w:t>
-      </w:r>
-    </w:p>
-    <w:p>
-      <w:pPr>
-        <w:pStyle w:val="ListParagraph"/>
-        <w:numPr>
-          <w:ilvl w:val="0"/>
-          <w:numId w:val="2"/>
-        </w:numPr>
-        <w:spacing w:after="60" w:line="276"/>
-      </w:pPr>
-      <w:r>
-        <w:rPr>
-          <w:rFonts w:ascii="Aptos" w:cs="Aptos" w:eastAsia="Aptos" w:hAnsi="Aptos"/>
-          <w:b/>
-          <w:bCs/>
-          <w:sz w:val="21"/>
-          <w:szCs w:val="21"/>
-        </w:rPr>
-        <w:t xml:space="preserve">Configuration and log review. </w:t>
-      </w:r>
-      <w:r>
-        <w:rPr>
-          <w:rFonts w:ascii="Aptos" w:cs="Aptos" w:eastAsia="Aptos" w:hAnsi="Aptos"/>
-          <w:sz w:val="21"/>
-          <w:szCs w:val="21"/>
-        </w:rPr>
-        <w:t xml:space="preserve">Firewall, switch, SCADA and server settings; event and security logs for anomalies.</w:t>
-      </w:r>
-    </w:p>
-    <w:p>
-      <w:pPr>
-        <w:pStyle w:val="ListParagraph"/>
-        <w:numPr>
-          <w:ilvl w:val="0"/>
-          <w:numId w:val="2"/>
-        </w:numPr>
-        <w:spacing w:after="60" w:line="276"/>
-      </w:pPr>
-      <w:r>
-        <w:rPr>
-          <w:rFonts w:ascii="Aptos" w:cs="Aptos" w:eastAsia="Aptos" w:hAnsi="Aptos"/>
-          <w:b/>
-          <w:bCs/>
-          <w:sz w:val="21"/>
-          <w:szCs w:val="21"/>
-        </w:rPr>
-        <w:t xml:space="preserve">Non-intrusive OT assessment. </w:t>
-      </w:r>
-      <w:r>
-        <w:rPr>
-          <w:rFonts w:ascii="Aptos" w:cs="Aptos" w:eastAsia="Aptos" w:hAnsi="Aptos"/>
-          <w:sz w:val="21"/>
-          <w:szCs w:val="21"/>
-        </w:rPr>
-        <w:t xml:space="preserve">Segmentation, SCADA and PLC access, remote connections, vendor VPN usage, control-room physical security.</w:t>
-      </w:r>
-    </w:p>
-    <w:p>
-      <w:pPr>
-        <w:pStyle w:val="ListParagraph"/>
-        <w:numPr>
-          <w:ilvl w:val="0"/>
-          <w:numId w:val="2"/>
-        </w:numPr>
-        <w:spacing w:after="60" w:line="276"/>
-      </w:pPr>
-      <w:r>
-        <w:rPr>
-          <w:rFonts w:ascii="Aptos" w:cs="Aptos" w:eastAsia="Aptos" w:hAnsi="Aptos"/>
-          <w:b/>
-          <w:bCs/>
-          <w:sz w:val="21"/>
-          <w:szCs w:val="21"/>
-        </w:rPr>
-        <w:t xml:space="preserve">Closing meeting and reporting. </w:t>
-      </w:r>
-      <w:r>
-        <w:rPr>
-          <w:rFonts w:ascii="Aptos" w:cs="Aptos" w:eastAsia="Aptos" w:hAnsi="Aptos"/>
-          <w:sz w:val="21"/>
-          <w:szCs w:val="21"/>
-        </w:rPr>
-        <w:t xml:space="preserve">Findings validated with management, then the full report, compliance score and remediation roadmap.</w:t>
-      </w:r>
-    </w:p>
-    <w:tbl>
-      <w:tblPr>
-        <w:tblW w:type="dxa" w:w="9026"/>
-        <w:tblBorders>
-          <w:top w:val="single" w:color="F2F5FA" w:sz="2"/>
-          <w:left w:val="single" w:color="1F6FEB" w:sz="18"/>
-          <w:bottom w:val="single" w:color="F2F5FA" w:sz="2"/>
-          <w:right w:val="single" w:color="F2F5FA" w:sz="2"/>
-          <w:insideH w:val="none" w:color="F2F5FA" w:sz="0"/>
-          <w:insideV w:val="none" w:color="F2F5FA" w:sz="0"/>
-        </w:tblBorders>
-      </w:tblPr>
-      <w:tblGrid>
-        <w:gridCol w:w="9026"/>
-      </w:tblGrid>
-      <w:tr>
-        <w:tc>
-          <w:tcPr>
-            <w:tcW w:type="dxa" w:w="9026"/>
-            <w:shd w:fill="F2F5FA" w:color="auto" w:val="clear"/>
-            <w:tcMar>
-              <w:top w:type="dxa" w:w="160"/>
-              <w:left w:type="dxa" w:w="220"/>
-              <w:bottom w:type="dxa" w:w="160"/>
-              <w:right w:type="dxa" w:w="220"/>
-            </w:tcMar>
-          </w:tcPr>
-          <w:p>
-            <w:pPr>
-              <w:spacing w:after="100"/>
-            </w:pPr>
-            <w:r>
-              <w:rPr>
-                <w:rFonts w:ascii="Aptos" w:cs="Aptos" w:eastAsia="Aptos" w:hAnsi="Aptos"/>
-                <w:b/>
-                <w:bCs/>
-                <w:color w:val="5A6472"/>
-                <w:spacing w:val="30"/>
-                <w:sz w:val="15"/>
-                <w:szCs w:val="15"/>
-              </w:rPr>
-              <w:t xml:space="preserve">CALLOUT — PLACE THIS NEXT TO THE STAGE LIST</w:t>
-            </w:r>
-          </w:p>
-          <w:p>
-            <w:pPr>
-              <w:spacing w:after="60"/>
-            </w:pPr>
-            <w:r>
-              <w:rPr>
-                <w:rFonts w:ascii="Aptos" w:cs="Aptos" w:eastAsia="Aptos" w:hAnsi="Aptos"/>
-                <w:b/>
-                <w:bCs/>
-                <w:color w:val="0A1B3D"/>
-                <w:sz w:val="24"/>
-                <w:szCs w:val="24"/>
-              </w:rPr>
-              <w:t xml:space="preserve">Non-intrusive by design.</w:t>
-            </w:r>
-          </w:p>
-          <w:p>
-            <w:pPr>
-              <w:spacing w:after="60"/>
-            </w:pPr>
-            <w:r>
-              <w:rPr>
-                <w:rFonts w:ascii="Aptos" w:cs="Aptos" w:eastAsia="Aptos" w:hAnsi="Aptos"/>
-                <w:sz w:val="20"/>
-                <w:szCs w:val="20"/>
-              </w:rPr>
-              <w:t xml:space="preserve">Every OT test is passive. We assess exposure without scanning live control systems, and nothing we do requires plant downtime. This is the first question every plant manager asks, so here is the answer up front.</w:t>
-            </w:r>
-          </w:p>
-        </w:tc>
-      </w:tr>
-    </w:tbl>
-    <w:p>
-      <w:pPr>
-        <w:pStyle w:val="Heading2"/>
-        <w:spacing w:after="120" w:before="300"/>
-      </w:pPr>
-      <w:r>
-        <w:rPr>
-          <w:rFonts w:ascii="Aptos" w:cs="Aptos" w:eastAsia="Aptos" w:hAnsi="Aptos"/>
-          <w:b/>
-          <w:bCs/>
-          <w:color w:val="0A1B3D"/>
-          <w:sz w:val="26"/>
-          <w:szCs w:val="26"/>
-        </w:rPr>
-        <w:t xml:space="preserve">4.7 What you receive</w:t>
+        <w:t xml:space="preserve">4.5 What you receive</w:t>
       </w:r>
     </w:p>
     <w:p>
@@ -4179,7 +3874,7 @@
           <w:sz w:val="26"/>
           <w:szCs w:val="26"/>
         </w:rPr>
-        <w:t xml:space="preserve">4.8 Why xLoop</w:t>
+        <w:t xml:space="preserve">4.6 Why xLoop</w:t>
       </w:r>
     </w:p>
     <w:tbl>
@@ -4346,7 +4041,7 @@
           <w:sz w:val="26"/>
           <w:szCs w:val="26"/>
         </w:rPr>
-        <w:t xml:space="preserve">4.9 FAQ — written for AI answer engines</w:t>
+        <w:t xml:space="preserve">4.7 FAQ — written for AI answer engines</w:t>
       </w:r>
     </w:p>
     <w:p>
@@ -5875,7 +5570,7 @@
           <w:sz w:val="21"/>
           <w:szCs w:val="21"/>
         </w:rPr>
-        <w:t xml:space="preserve">— the six questions in section 4.9, verbatim.</w:t>
+        <w:t xml:space="preserve">— the six questions in section 4.7, verbatim. Every answer must be in the page source, not fetched on accordion open.</w:t>
       </w:r>
     </w:p>
     <w:p>

</xml_diff>